<commit_message>
Initialize Test II: Clean tracking for Handwritten VLM pipeline
</commit_message>
<xml_diff>
--- a/report/renAIssance_Printed_OCR_Proposal.docx
+++ b/report/renAIssance_Printed_OCR_Proposal.docx
@@ -15,6 +15,7 @@
         </w:rPr>
       </w:pPr>
       <w:bookmarkStart w:id="0" w:name="renaissance-printed-ocr"/>
+      <w:proofErr w:type="spellStart"/>
       <w:r>
         <w:rPr>
           <w:rFonts w:ascii="Times New Roman" w:hAnsi="Times New Roman" w:cs="Times New Roman"/>
@@ -23,7 +24,18 @@
           <w:color w:val="000000" w:themeColor="text1"/>
           <w:u w:val="single"/>
         </w:rPr>
-        <w:t>GSOC 2026 PROPOSAL</w:t>
+        <w:t>renAIssance</w:t>
+      </w:r>
+      <w:proofErr w:type="spellEnd"/>
+      <w:r>
+        <w:rPr>
+          <w:rFonts w:ascii="Times New Roman" w:hAnsi="Times New Roman" w:cs="Times New Roman"/>
+          <w:b/>
+          <w:bCs/>
+          <w:color w:val="000000" w:themeColor="text1"/>
+          <w:u w:val="single"/>
+        </w:rPr>
+        <w:t>: Print OCR</w:t>
       </w:r>
     </w:p>
     <w:p>
@@ -934,8 +946,8 @@
         <w:tblLook w:val="0020" w:firstRow="1" w:lastRow="0" w:firstColumn="0" w:lastColumn="0" w:noHBand="0" w:noVBand="0"/>
       </w:tblPr>
       <w:tblGrid>
-        <w:gridCol w:w="5746"/>
-        <w:gridCol w:w="3830"/>
+        <w:gridCol w:w="5616"/>
+        <w:gridCol w:w="3744"/>
       </w:tblGrid>
       <w:tr>
         <w:trPr>

</xml_diff>